<commit_message>
Añadida nueva carpeta con archivos Python
</commit_message>
<xml_diff>
--- a/PRÁCTICA GIT (1).docx
+++ b/PRÁCTICA GIT (1).docx
@@ -152,7 +152,7 @@
       </w:pPr>
       <w:r>
         <w:drawing>
-          <wp:inline wp14:editId="6F253078" wp14:anchorId="75E1D1DC">
+          <wp:inline wp14:editId="73020CFB" wp14:anchorId="75E1D1DC">
             <wp:extent cx="5400675" cy="1838344"/>
             <wp:effectExtent l="0" t="0" r="0" b="0"/>
             <wp:docPr id="1669423125" name="drawing"/>
@@ -202,7 +202,7 @@
       </w:pPr>
       <w:r>
         <w:drawing>
-          <wp:inline wp14:editId="4ECF1265" wp14:anchorId="43042EC3">
+          <wp:inline wp14:editId="0C719F27" wp14:anchorId="43042EC3">
             <wp:extent cx="5400675" cy="1314450"/>
             <wp:effectExtent l="0" t="0" r="0" b="0"/>
             <wp:docPr id="1864047496" name="drawing"/>
@@ -794,7 +794,7 @@
       </w:pPr>
       <w:r>
         <w:drawing>
-          <wp:inline wp14:editId="3B51C98B" wp14:anchorId="265B0002">
+          <wp:inline wp14:editId="3FD90AC4" wp14:anchorId="265B0002">
             <wp:extent cx="5400675" cy="2085975"/>
             <wp:effectExtent l="0" t="0" r="0" b="0"/>
             <wp:docPr id="191367925" name="drawing"/>
@@ -881,7 +881,7 @@
       </w:pPr>
       <w:r>
         <w:drawing>
-          <wp:inline wp14:editId="0D5FB05D" wp14:anchorId="40FFD570">
+          <wp:inline wp14:editId="612DB96C" wp14:anchorId="40FFD570">
             <wp:extent cx="5400675" cy="2524125"/>
             <wp:effectExtent l="0" t="0" r="0" b="0"/>
             <wp:docPr id="2010750316" name="drawing"/>
@@ -964,7 +964,7 @@
       </w:pPr>
       <w:r>
         <w:drawing>
-          <wp:inline wp14:editId="13968B8E" wp14:anchorId="7D212690">
+          <wp:inline wp14:editId="5772C51D" wp14:anchorId="7D212690">
             <wp:extent cx="5400675" cy="895350"/>
             <wp:effectExtent l="0" t="0" r="0" b="0"/>
             <wp:docPr id="1364130413" name="drawing"/>
@@ -1021,17 +1021,160 @@
           <w:ilvl w:val="0"/>
           <w:numId w:val="2"/>
         </w:numPr>
-      </w:pPr>
-      <w:r>
+        <w:rPr/>
+      </w:pPr>
+      <w:r>
+        <w:rPr/>
         <w:t xml:space="preserve">Hacer cambios en ese documento y volver a hacer un </w:t>
       </w:r>
-      <w:proofErr w:type="spellStart"/>
-      <w:r>
+      <w:r>
+        <w:rPr/>
         <w:t>commit</w:t>
       </w:r>
-      <w:proofErr w:type="spellEnd"/>
-      <w:r>
+      <w:r>
+        <w:rPr/>
         <w:t xml:space="preserve"> para que se actualice</w:t>
+      </w:r>
+    </w:p>
+    <w:p>
+      <w:pPr>
+        <w:pStyle w:val="Prrafodelista"/>
+        <w:ind w:left="720"/>
+      </w:pPr>
+      <w:r>
+        <w:drawing>
+          <wp:inline wp14:editId="0589FB84" wp14:anchorId="1FD6D798">
+            <wp:extent cx="4962525" cy="1562100"/>
+            <wp:effectExtent l="0" t="0" r="0" b="0"/>
+            <wp:docPr id="2030565407" name="drawing"/>
+            <wp:cNvGraphicFramePr>
+              <a:graphicFrameLocks noChangeAspect="1"/>
+            </wp:cNvGraphicFramePr>
+            <a:graphic>
+              <a:graphicData xmlns:a="http://schemas.openxmlformats.org/drawingml/2006/main" uri="http://schemas.openxmlformats.org/drawingml/2006/picture">
+                <pic:pic xmlns:pic="http://schemas.openxmlformats.org/drawingml/2006/picture">
+                  <pic:nvPicPr>
+                    <pic:cNvPr id="2030565407" name="Picture 2030565407"/>
+                    <pic:cNvPicPr/>
+                  </pic:nvPicPr>
+                  <pic:blipFill>
+                    <a:blip xmlns:r="http://schemas.openxmlformats.org/officeDocument/2006/relationships" r:embed="rId1619197275">
+                      <a:extLst>
+                        <a:ext uri="{28A0092B-C50C-407E-A947-70E740481C1C}">
+                          <a14:useLocalDpi xmlns:a14="http://schemas.microsoft.com/office/drawing/2010/main"/>
+                        </a:ext>
+                      </a:extLst>
+                    </a:blip>
+                    <a:stretch>
+                      <a:fillRect/>
+                    </a:stretch>
+                  </pic:blipFill>
+                  <pic:spPr>
+                    <a:xfrm>
+                      <a:off x="0" y="0"/>
+                      <a:ext cx="4962525" cy="1562100"/>
+                    </a:xfrm>
+                    <a:prstGeom prst="rect">
+                      <a:avLst/>
+                    </a:prstGeom>
+                  </pic:spPr>
+                </pic:pic>
+              </a:graphicData>
+            </a:graphic>
+          </wp:inline>
+        </w:drawing>
+      </w:r>
+      <w:r>
+        <w:drawing>
+          <wp:inline wp14:editId="09D8CC55" wp14:anchorId="5649F796">
+            <wp:extent cx="5400675" cy="1514475"/>
+            <wp:effectExtent l="0" t="0" r="0" b="0"/>
+            <wp:docPr id="1517884457" name="drawing"/>
+            <wp:cNvGraphicFramePr>
+              <a:graphicFrameLocks noChangeAspect="1"/>
+            </wp:cNvGraphicFramePr>
+            <a:graphic>
+              <a:graphicData xmlns:a="http://schemas.openxmlformats.org/drawingml/2006/main" uri="http://schemas.openxmlformats.org/drawingml/2006/picture">
+                <pic:pic xmlns:pic="http://schemas.openxmlformats.org/drawingml/2006/picture">
+                  <pic:nvPicPr>
+                    <pic:cNvPr id="1517884457" name="Picture 1517884457"/>
+                    <pic:cNvPicPr/>
+                  </pic:nvPicPr>
+                  <pic:blipFill>
+                    <a:blip xmlns:r="http://schemas.openxmlformats.org/officeDocument/2006/relationships" r:embed="rId1526285379">
+                      <a:extLst>
+                        <a:ext uri="{28A0092B-C50C-407E-A947-70E740481C1C}">
+                          <a14:useLocalDpi xmlns:a14="http://schemas.microsoft.com/office/drawing/2010/main"/>
+                        </a:ext>
+                      </a:extLst>
+                    </a:blip>
+                    <a:stretch>
+                      <a:fillRect/>
+                    </a:stretch>
+                  </pic:blipFill>
+                  <pic:spPr>
+                    <a:xfrm>
+                      <a:off x="0" y="0"/>
+                      <a:ext cx="5400675" cy="1514475"/>
+                    </a:xfrm>
+                    <a:prstGeom prst="rect">
+                      <a:avLst/>
+                    </a:prstGeom>
+                  </pic:spPr>
+                </pic:pic>
+              </a:graphicData>
+            </a:graphic>
+          </wp:inline>
+        </w:drawing>
+      </w:r>
+    </w:p>
+    <w:p>
+      <w:pPr>
+        <w:pStyle w:val="Prrafodelista"/>
+        <w:ind w:left="720"/>
+      </w:pPr>
+      <w:r>
+        <w:drawing>
+          <wp:inline wp14:editId="3137469D" wp14:anchorId="6AE0FDAD">
+            <wp:extent cx="5400675" cy="1028700"/>
+            <wp:effectExtent l="0" t="0" r="0" b="0"/>
+            <wp:docPr id="1443879490" name="drawing"/>
+            <wp:cNvGraphicFramePr>
+              <a:graphicFrameLocks noChangeAspect="1"/>
+            </wp:cNvGraphicFramePr>
+            <a:graphic>
+              <a:graphicData xmlns:a="http://schemas.openxmlformats.org/drawingml/2006/main" uri="http://schemas.openxmlformats.org/drawingml/2006/picture">
+                <pic:pic xmlns:pic="http://schemas.openxmlformats.org/drawingml/2006/picture">
+                  <pic:nvPicPr>
+                    <pic:cNvPr id="1443879490" name="Picture 1443879490"/>
+                    <pic:cNvPicPr/>
+                  </pic:nvPicPr>
+                  <pic:blipFill>
+                    <a:blip xmlns:r="http://schemas.openxmlformats.org/officeDocument/2006/relationships" r:embed="rId1188765731">
+                      <a:extLst>
+                        <a:ext uri="{28A0092B-C50C-407E-A947-70E740481C1C}">
+                          <a14:useLocalDpi xmlns:a14="http://schemas.microsoft.com/office/drawing/2010/main"/>
+                        </a:ext>
+                      </a:extLst>
+                    </a:blip>
+                    <a:stretch>
+                      <a:fillRect/>
+                    </a:stretch>
+                  </pic:blipFill>
+                  <pic:spPr>
+                    <a:xfrm>
+                      <a:off x="0" y="0"/>
+                      <a:ext cx="5400675" cy="1028700"/>
+                    </a:xfrm>
+                    <a:prstGeom prst="rect">
+                      <a:avLst/>
+                    </a:prstGeom>
+                  </pic:spPr>
+                </pic:pic>
+              </a:graphicData>
+            </a:graphic>
+          </wp:inline>
+        </w:drawing>
       </w:r>
     </w:p>
     <w:p>

</xml_diff>